<commit_message>
Update package references to versions 8.0.24, 9.0.13, and 10.0.3
</commit_message>
<xml_diff>
--- a/.assets/nupkg-icon.docx
+++ b/.assets/nupkg-icon.docx
@@ -1,10 +1,8 @@
 
 <file path=word/document.xml><?xml version="1.0" encoding="utf-8"?>
-<w:document xmlns:wpc="http://schemas.microsoft.com/office/word/2010/wordprocessingCanvas" xmlns:cx="http://schemas.microsoft.com/office/drawing/2014/chartex" xmlns:cx1="http://schemas.microsoft.com/office/drawing/2015/9/8/chartex" xmlns:cx2="http://schemas.microsoft.com/office/drawing/2015/10/21/chartex" xmlns:cx3="http://schemas.microsoft.com/office/drawing/2016/5/9/chartex" xmlns:cx4="http://schemas.microsoft.com/office/drawing/2016/5/10/chartex" xmlns:cx5="http://schemas.microsoft.com/office/drawing/2016/5/11/chartex" xmlns:cx6="http://schemas.microsoft.com/office/drawing/2016/5/12/chartex" xmlns:cx7="http://schemas.microsoft.com/office/drawing/2016/5/13/chartex" xmlns:cx8="http://schemas.microsoft.com/office/drawing/2016/5/14/chartex" xmlns:mc="http://schemas.openxmlformats.org/markup-compatibility/2006" xmlns:aink="http://schemas.microsoft.com/office/drawing/2016/ink" xmlns:am3d="http://schemas.microsoft.com/office/drawing/2017/model3d" xmlns:o="urn:schemas-microsoft-com:office:office" xmlns:r="http://schemas.openxmlformats.org/officeDocument/2006/relationships" xmlns:m="http://schemas.openxmlformats.org/officeDocument/2006/math" xmlns:v="urn:schemas-microsoft-com:vml" xmlns:wp14="http://schemas.microsoft.com/office/word/2010/wordprocessingDrawing" xmlns:wp="http://schemas.openxmlformats.org/drawingml/2006/wordprocessingDrawing" xmlns:w10="urn:schemas-microsoft-com:office:word" xmlns:w="http://schemas.openxmlformats.org/wordprocessingml/2006/main" xmlns:w14="http://schemas.microsoft.com/office/word/2010/wordml" xmlns:w15="http://schemas.microsoft.com/office/word/2012/wordml" xmlns:w16cid="http://schemas.microsoft.com/office/word/2016/wordml/cid" xmlns:w16se="http://schemas.microsoft.com/office/word/2015/wordml/symex" xmlns:wpg="http://schemas.microsoft.com/office/word/2010/wordprocessingGroup" xmlns:wpi="http://schemas.microsoft.com/office/word/2010/wordprocessingInk" xmlns:wne="http://schemas.microsoft.com/office/word/2006/wordml" xmlns:wps="http://schemas.microsoft.com/office/word/2010/wordprocessingShape" mc:Ignorable="w14 w15 w16se w16cid wp14">
+<w:document xmlns:wpc="http://schemas.microsoft.com/office/word/2010/wordprocessingCanvas" xmlns:cx="http://schemas.microsoft.com/office/drawing/2014/chartex" xmlns:cx1="http://schemas.microsoft.com/office/drawing/2015/9/8/chartex" xmlns:cx2="http://schemas.microsoft.com/office/drawing/2015/10/21/chartex" xmlns:cx3="http://schemas.microsoft.com/office/drawing/2016/5/9/chartex" xmlns:cx4="http://schemas.microsoft.com/office/drawing/2016/5/10/chartex" xmlns:cx5="http://schemas.microsoft.com/office/drawing/2016/5/11/chartex" xmlns:cx6="http://schemas.microsoft.com/office/drawing/2016/5/12/chartex" xmlns:cx7="http://schemas.microsoft.com/office/drawing/2016/5/13/chartex" xmlns:cx8="http://schemas.microsoft.com/office/drawing/2016/5/14/chartex" xmlns:mc="http://schemas.openxmlformats.org/markup-compatibility/2006" xmlns:aink="http://schemas.microsoft.com/office/drawing/2016/ink" xmlns:am3d="http://schemas.microsoft.com/office/drawing/2017/model3d" xmlns:o="urn:schemas-microsoft-com:office:office" xmlns:oel="http://schemas.microsoft.com/office/2019/extlst" xmlns:r="http://schemas.openxmlformats.org/officeDocument/2006/relationships" xmlns:m="http://schemas.openxmlformats.org/officeDocument/2006/math" xmlns:v="urn:schemas-microsoft-com:vml" xmlns:wp14="http://schemas.microsoft.com/office/word/2010/wordprocessingDrawing" xmlns:wp="http://schemas.openxmlformats.org/drawingml/2006/wordprocessingDrawing" xmlns:w10="urn:schemas-microsoft-com:office:word" xmlns:w="http://schemas.openxmlformats.org/wordprocessingml/2006/main" xmlns:w14="http://schemas.microsoft.com/office/word/2010/wordml" xmlns:w15="http://schemas.microsoft.com/office/word/2012/wordml" xmlns:w16cex="http://schemas.microsoft.com/office/word/2018/wordml/cex" xmlns:w16cid="http://schemas.microsoft.com/office/word/2016/wordml/cid" xmlns:w16="http://schemas.microsoft.com/office/word/2018/wordml" xmlns:w16du="http://schemas.microsoft.com/office/word/2023/wordml/word16du" xmlns:w16sdtdh="http://schemas.microsoft.com/office/word/2020/wordml/sdtdatahash" xmlns:w16sdtfl="http://schemas.microsoft.com/office/word/2024/wordml/sdtformatlock" xmlns:w16se="http://schemas.microsoft.com/office/word/2015/wordml/symex" xmlns:wpg="http://schemas.microsoft.com/office/word/2010/wordprocessingGroup" xmlns:wpi="http://schemas.microsoft.com/office/word/2010/wordprocessingInk" xmlns:wne="http://schemas.microsoft.com/office/word/2006/wordml" xmlns:wps="http://schemas.microsoft.com/office/word/2010/wordprocessingShape" mc:Ignorable="w14 w15 w16se w16cid w16 w16cex w16sdtdh w16sdtfl w16du wp14">
   <w:body>
     <w:p>
-      <w:bookmarkStart w:id="0" w:name="_GoBack"/>
-      <w:bookmarkEnd w:id="0"/>
       <w:r>
         <w:rPr>
           <w:noProof/>
@@ -94,7 +92,7 @@
           </mc:Choice>
           <mc:Fallback>
             <w:pict>
-              <v:rect w14:anchorId="19969831" id="Rectangle 2" o:spid="_x0000_s1026" style="position:absolute;margin-left:174.85pt;margin-top:225.75pt;width:95.65pt;height:64.45pt;z-index:251665408;visibility:visible;mso-wrap-style:square;mso-wrap-distance-left:9pt;mso-wrap-distance-top:0;mso-wrap-distance-right:9pt;mso-wrap-distance-bottom:0;mso-position-horizontal:absolute;mso-position-horizontal-relative:text;mso-position-vertical:absolute;mso-position-vertical-relative:text;v-text-anchor:middle" o:gfxdata="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" filled="f" stroked="f" strokeweight="1pt">
+              <v:rect w14:anchorId="19969831" id="Rectangle 2" o:spid="_x0000_s1026" style="position:absolute;margin-left:174.85pt;margin-top:225.75pt;width:95.65pt;height:64.45pt;z-index:251665408;visibility:visible;mso-wrap-style:square;mso-wrap-distance-left:9pt;mso-wrap-distance-top:0;mso-wrap-distance-right:9pt;mso-wrap-distance-bottom:0;mso-position-horizontal:absolute;mso-position-horizontal-relative:text;mso-position-vertical:absolute;mso-position-vertical-relative:text;v-text-anchor:middle" o:gfxdata="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" filled="f" stroked="f" strokeweight="1pt">
                 <v:textbox inset="0,0,0,0">
                   <w:txbxContent>
                     <w:p>
@@ -129,7 +127,7 @@
         <mc:AlternateContent>
           <mc:Choice Requires="wps">
             <w:drawing>
-              <wp:anchor distT="0" distB="0" distL="114300" distR="114300" simplePos="0" relativeHeight="251664384" behindDoc="0" locked="0" layoutInCell="1" allowOverlap="1" wp14:anchorId="75B9421D" wp14:editId="025BEE47">
+              <wp:anchor distT="0" distB="0" distL="114300" distR="114300" simplePos="0" relativeHeight="251664384" behindDoc="0" locked="0" layoutInCell="1" allowOverlap="1" wp14:anchorId="75B9421D" wp14:editId="7DEB2551">
                 <wp:simplePos x="0" y="0"/>
                 <wp:positionH relativeFrom="column">
                   <wp:posOffset>2221675</wp:posOffset>
@@ -155,7 +153,7 @@
                           <a:avLst/>
                         </a:prstGeom>
                         <a:solidFill>
-                          <a:srgbClr val="682A7B"/>
+                          <a:srgbClr val="4C2DCC"/>
                         </a:solidFill>
                         <a:ln>
                           <a:noFill/>
@@ -191,7 +189,7 @@
           </mc:Choice>
           <mc:Fallback>
             <w:pict>
-              <v:rect w14:anchorId="1FB56879" id="Rectangle 1" o:spid="_x0000_s1026" style="position:absolute;margin-left:174.95pt;margin-top:207pt;width:96pt;height:96pt;z-index:251664384;visibility:visible;mso-wrap-style:square;mso-wrap-distance-left:9pt;mso-wrap-distance-top:0;mso-wrap-distance-right:9pt;mso-wrap-distance-bottom:0;mso-position-horizontal:absolute;mso-position-horizontal-relative:text;mso-position-vertical:absolute;mso-position-vertical-relative:text;v-text-anchor:middle" o:gfxdata="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" fillcolor="#682a7b" stroked="f" strokeweight="1pt"/>
+              <v:rect w14:anchorId="2E4572C1" id="Rectangle 1" o:spid="_x0000_s1026" style="position:absolute;margin-left:174.95pt;margin-top:207pt;width:96pt;height:96pt;z-index:251664384;visibility:visible;mso-wrap-style:square;mso-wrap-distance-left:9pt;mso-wrap-distance-top:0;mso-wrap-distance-right:9pt;mso-wrap-distance-bottom:0;mso-position-horizontal:absolute;mso-position-horizontal-relative:text;mso-position-vertical:absolute;mso-position-vertical-relative:text;v-text-anchor:middle" o:gfxdata="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" fillcolor="#4c2dcc" stroked="f" strokeweight="1pt"/>
             </w:pict>
           </mc:Fallback>
         </mc:AlternateContent>
@@ -271,7 +269,7 @@
 </file>
 
 <file path=word/styles.xml><?xml version="1.0" encoding="utf-8"?>
-<w:styles xmlns:mc="http://schemas.openxmlformats.org/markup-compatibility/2006" xmlns:r="http://schemas.openxmlformats.org/officeDocument/2006/relationships" xmlns:w="http://schemas.openxmlformats.org/wordprocessingml/2006/main" xmlns:w14="http://schemas.microsoft.com/office/word/2010/wordml" xmlns:w15="http://schemas.microsoft.com/office/word/2012/wordml" xmlns:w16cid="http://schemas.microsoft.com/office/word/2016/wordml/cid" xmlns:w16se="http://schemas.microsoft.com/office/word/2015/wordml/symex" mc:Ignorable="w14 w15 w16se w16cid">
+<w:styles xmlns:mc="http://schemas.openxmlformats.org/markup-compatibility/2006" xmlns:r="http://schemas.openxmlformats.org/officeDocument/2006/relationships" xmlns:w="http://schemas.openxmlformats.org/wordprocessingml/2006/main" xmlns:w14="http://schemas.microsoft.com/office/word/2010/wordml" xmlns:w15="http://schemas.microsoft.com/office/word/2012/wordml" xmlns:w16cex="http://schemas.microsoft.com/office/word/2018/wordml/cex" xmlns:w16cid="http://schemas.microsoft.com/office/word/2016/wordml/cid" xmlns:w16="http://schemas.microsoft.com/office/word/2018/wordml" xmlns:w16du="http://schemas.microsoft.com/office/word/2023/wordml/word16du" xmlns:w16sdtdh="http://schemas.microsoft.com/office/word/2020/wordml/sdtdatahash" xmlns:w16sdtfl="http://schemas.microsoft.com/office/word/2024/wordml/sdtformatlock" xmlns:w16se="http://schemas.microsoft.com/office/word/2015/wordml/symex" mc:Ignorable="w14 w15 w16se w16cid w16 w16cex w16sdtdh w16sdtfl w16du">
   <w:docDefaults>
     <w:rPrDefault>
       <w:rPr>
@@ -287,7 +285,7 @@
       </w:pPr>
     </w:pPrDefault>
   </w:docDefaults>
-  <w:latentStyles w:defLockedState="0" w:defUIPriority="99" w:defSemiHidden="0" w:defUnhideWhenUsed="0" w:defQFormat="0" w:count="377">
+  <w:latentStyles w:defLockedState="0" w:defUIPriority="99" w:defSemiHidden="0" w:defUnhideWhenUsed="0" w:defQFormat="0" w:count="376">
     <w:lsdException w:name="Normal" w:uiPriority="0" w:qFormat="1"/>
     <w:lsdException w:name="heading 1" w:uiPriority="9" w:qFormat="1"/>
     <w:lsdException w:name="heading 2" w:semiHidden="1" w:uiPriority="9" w:unhideWhenUsed="1" w:qFormat="1"/>
@@ -664,7 +662,6 @@
     <w:lsdException w:name="Hashtag" w:semiHidden="1" w:unhideWhenUsed="1"/>
     <w:lsdException w:name="Unresolved Mention" w:semiHidden="1" w:unhideWhenUsed="1"/>
     <w:lsdException w:name="Smart Link" w:semiHidden="1" w:unhideWhenUsed="1"/>
-    <w:lsdException w:name="Smart Link Error" w:semiHidden="1" w:unhideWhenUsed="1"/>
   </w:latentStyles>
   <w:style w:type="paragraph" w:default="1" w:styleId="Normal">
     <w:name w:val="Normal"/>

</xml_diff>